<commit_message>
add option  to select taper direction (facing toe or heel)
</commit_message>
<xml_diff>
--- a/report_temp/retaining_wall_report.docx
+++ b/report_temp/retaining_wall_report.docx
@@ -24,7 +24,7 @@
         <w:rPr>
           <w:sz w:val="20"/>
         </w:rPr>
-        <w:t>Date: July 18, 2026</w:t>
+        <w:t>Date: July 19, 2026</w:t>
       </w:r>
     </w:p>
     <w:p>
@@ -315,6 +315,102 @@
           </w:p>
         </w:tc>
       </w:tr>
+      <w:tr>
+        <w:tc>
+          <w:tcPr>
+            <w:tcW w:type="dxa" w:w="3120"/>
+          </w:tcPr>
+          <w:p>
+            <w:r>
+              <w:t>Shear key distance</w:t>
+            </w:r>
+          </w:p>
+        </w:tc>
+        <w:tc>
+          <w:tcPr>
+            <w:tcW w:type="dxa" w:w="3120"/>
+          </w:tcPr>
+          <w:p>
+            <w:r>
+              <w:t>x_sk</w:t>
+            </w:r>
+          </w:p>
+        </w:tc>
+        <w:tc>
+          <w:tcPr>
+            <w:tcW w:type="dxa" w:w="3120"/>
+          </w:tcPr>
+          <w:p>
+            <w:r>
+              <w:t>1.200 m</w:t>
+            </w:r>
+          </w:p>
+        </w:tc>
+      </w:tr>
+      <w:tr>
+        <w:tc>
+          <w:tcPr>
+            <w:tcW w:type="dxa" w:w="3120"/>
+          </w:tcPr>
+          <w:p>
+            <w:r>
+              <w:t>Shear key width</w:t>
+            </w:r>
+          </w:p>
+        </w:tc>
+        <w:tc>
+          <w:tcPr>
+            <w:tcW w:type="dxa" w:w="3120"/>
+          </w:tcPr>
+          <w:p>
+            <w:r>
+              <w:t>w_sk</w:t>
+            </w:r>
+          </w:p>
+        </w:tc>
+        <w:tc>
+          <w:tcPr>
+            <w:tcW w:type="dxa" w:w="3120"/>
+          </w:tcPr>
+          <w:p>
+            <w:r>
+              <w:t>0.500 m</w:t>
+            </w:r>
+          </w:p>
+        </w:tc>
+      </w:tr>
+      <w:tr>
+        <w:tc>
+          <w:tcPr>
+            <w:tcW w:type="dxa" w:w="3120"/>
+          </w:tcPr>
+          <w:p>
+            <w:r>
+              <w:t>Shear key thickness</w:t>
+            </w:r>
+          </w:p>
+        </w:tc>
+        <w:tc>
+          <w:tcPr>
+            <w:tcW w:type="dxa" w:w="3120"/>
+          </w:tcPr>
+          <w:p>
+            <w:r>
+              <w:t>t_sk</w:t>
+            </w:r>
+          </w:p>
+        </w:tc>
+        <w:tc>
+          <w:tcPr>
+            <w:tcW w:type="dxa" w:w="3120"/>
+          </w:tcPr>
+          <w:p>
+            <w:r>
+              <w:t>0.200 m</w:t>
+            </w:r>
+          </w:p>
+        </w:tc>
+      </w:tr>
     </w:tbl>
     <w:p>
       <w:pPr>
@@ -520,7 +616,7 @@
           </w:tcPr>
           <w:p>
             <w:r>
-              <w:t>0.0333</w:t>
+              <w:t>0.0000</w:t>
             </w:r>
           </w:p>
         </w:tc>
@@ -530,7 +626,7 @@
           </w:tcPr>
           <w:p>
             <w:r>
-              <w:t>&gt;= 0.0208</w:t>
+              <w:t>N/A (Vertical)</w:t>
             </w:r>
           </w:p>
         </w:tc>
@@ -1910,12 +2006,12 @@
     </w:p>
     <w:p>
       <w:r>
-        <w:t>Sliding FS = 72.495 (Required &gt;= 1.5)</w:t>
+        <w:t>Sliding FS = inf (Required &gt;= 1.5)</w:t>
       </w:r>
     </w:p>
     <w:p>
       <w:r>
-        <w:t>Overturning FS = 4.297 (Required &gt;= 1.5)</w:t>
+        <w:t>Overturning FS = 4.087 (Required &gt;= 1.5)</w:t>
       </w:r>
     </w:p>
     <w:p>
@@ -1964,181 +2060,22 @@
         <w:pStyle w:val="Heading1"/>
       </w:pPr>
       <w:r>
-        <w:t>5. Bearing Capacity &amp; Settlement</w:t>
-      </w:r>
-    </w:p>
-    <w:p>
-      <w:pPr>
-        <w:pStyle w:val="Heading2"/>
-      </w:pPr>
-      <w:r>
-        <w:t>Bearing Stress &amp; Settlement Equations</w:t>
-      </w:r>
-    </w:p>
-    <w:p>
-      <w:r>
-        <w:t>Bearing contact stress:</w:t>
-      </w:r>
-    </w:p>
-    <w:p>
-      <w:r>
-        <w:drawing>
-          <wp:inline xmlns:a="http://schemas.openxmlformats.org/drawingml/2006/main" xmlns:pic="http://schemas.openxmlformats.org/drawingml/2006/picture">
-            <wp:extent cx="2011680" cy="369535"/>
-            <wp:docPr id="20" name="Picture 20"/>
-            <wp:cNvGraphicFramePr>
-              <a:graphicFrameLocks noChangeAspect="1"/>
-            </wp:cNvGraphicFramePr>
-            <a:graphic>
-              <a:graphicData uri="http://schemas.openxmlformats.org/drawingml/2006/picture">
-                <pic:pic>
-                  <pic:nvPicPr>
-                    <pic:cNvPr id="0" name="eq_bearing_stress.png"/>
-                    <pic:cNvPicPr/>
-                  </pic:nvPicPr>
-                  <pic:blipFill>
-                    <a:blip r:embed="rId28"/>
-                    <a:stretch>
-                      <a:fillRect/>
-                    </a:stretch>
-                  </pic:blipFill>
-                  <pic:spPr>
-                    <a:xfrm>
-                      <a:off x="0" y="0"/>
-                      <a:ext cx="2011680" cy="369535"/>
-                    </a:xfrm>
-                    <a:prstGeom prst="rect"/>
-                  </pic:spPr>
-                </pic:pic>
-              </a:graphicData>
-            </a:graphic>
-          </wp:inline>
-        </w:drawing>
-      </w:r>
-    </w:p>
-    <w:p>
-      <w:r>
-        <w:t>Bearing safety factor:</w:t>
-      </w:r>
-    </w:p>
-    <w:p>
-      <w:r>
-        <w:drawing>
-          <wp:inline xmlns:a="http://schemas.openxmlformats.org/drawingml/2006/main" xmlns:pic="http://schemas.openxmlformats.org/drawingml/2006/picture">
-            <wp:extent cx="1645920" cy="302347"/>
-            <wp:docPr id="21" name="Picture 21"/>
-            <wp:cNvGraphicFramePr>
-              <a:graphicFrameLocks noChangeAspect="1"/>
-            </wp:cNvGraphicFramePr>
-            <a:graphic>
-              <a:graphicData uri="http://schemas.openxmlformats.org/drawingml/2006/picture">
-                <pic:pic>
-                  <pic:nvPicPr>
-                    <pic:cNvPr id="0" name="eq_bearing_fs.png"/>
-                    <pic:cNvPicPr/>
-                  </pic:nvPicPr>
-                  <pic:blipFill>
-                    <a:blip r:embed="rId29"/>
-                    <a:stretch>
-                      <a:fillRect/>
-                    </a:stretch>
-                  </pic:blipFill>
-                  <pic:spPr>
-                    <a:xfrm>
-                      <a:off x="0" y="0"/>
-                      <a:ext cx="1645920" cy="302347"/>
-                    </a:xfrm>
-                    <a:prstGeom prst="rect"/>
-                  </pic:spPr>
-                </pic:pic>
-              </a:graphicData>
-            </a:graphic>
-          </wp:inline>
-        </w:drawing>
-      </w:r>
-    </w:p>
-    <w:p>
-      <w:r>
-        <w:t>Consolidation settlement:</w:t>
-      </w:r>
-    </w:p>
-    <w:p>
-      <w:r>
-        <w:drawing>
-          <wp:inline xmlns:a="http://schemas.openxmlformats.org/drawingml/2006/main" xmlns:pic="http://schemas.openxmlformats.org/drawingml/2006/picture">
-            <wp:extent cx="2286000" cy="419926"/>
-            <wp:docPr id="22" name="Picture 22"/>
-            <wp:cNvGraphicFramePr>
-              <a:graphicFrameLocks noChangeAspect="1"/>
-            </wp:cNvGraphicFramePr>
-            <a:graphic>
-              <a:graphicData uri="http://schemas.openxmlformats.org/drawingml/2006/picture">
-                <pic:pic>
-                  <pic:nvPicPr>
-                    <pic:cNvPr id="0" name="eq_settlement.png"/>
-                    <pic:cNvPicPr/>
-                  </pic:nvPicPr>
-                  <pic:blipFill>
-                    <a:blip r:embed="rId30"/>
-                    <a:stretch>
-                      <a:fillRect/>
-                    </a:stretch>
-                  </pic:blipFill>
-                  <pic:spPr>
-                    <a:xfrm>
-                      <a:off x="0" y="0"/>
-                      <a:ext cx="2286000" cy="419926"/>
-                    </a:xfrm>
-                    <a:prstGeom prst="rect"/>
-                  </pic:spPr>
-                </pic:pic>
-              </a:graphicData>
-            </a:graphic>
-          </wp:inline>
-        </w:drawing>
-      </w:r>
-    </w:p>
-    <w:p>
-      <w:r>
-        <w:t>Ultimate bearing capacity: 4506.35 kPa</w:t>
-      </w:r>
-    </w:p>
-    <w:p>
-      <w:r>
-        <w:t>Max bearing stress: 52.98 kPa</w:t>
-      </w:r>
-    </w:p>
-    <w:p>
-      <w:r>
-        <w:t>Safety factor: 85.05 (Required &gt;= 3.0)</w:t>
-      </w:r>
-    </w:p>
-    <w:p>
-      <w:r>
-        <w:t>Consolidation Settlement: 94.00 mm (Allowable: 153.33 mm)</w:t>
-      </w:r>
-    </w:p>
-    <w:p>
-      <w:pPr>
-        <w:pStyle w:val="Heading1"/>
-      </w:pPr>
-      <w:r>
         <w:t>6. Finite Element Settlement &amp; Base Displacements</w:t>
       </w:r>
     </w:p>
     <w:p>
       <w:r>
-        <w:t>Toe Settlement: 23.43 mm</w:t>
+        <w:t>Toe Settlement: 3.13 mm</w:t>
       </w:r>
     </w:p>
     <w:p>
       <w:r>
-        <w:t>Heel Settlement: 18.14 mm</w:t>
+        <w:t>Heel Settlement: 1.42 mm</w:t>
       </w:r>
     </w:p>
     <w:p>
       <w:r>
-        <w:t>Differential Settlement: 41.57 mm (Allowable: 50.00 mm)</w:t>
+        <w:t>Differential Settlement: 1.71 mm (Allowable: 50.00 mm)</w:t>
       </w:r>
     </w:p>
     <w:p>
@@ -2162,7 +2099,7 @@
         <w:drawing>
           <wp:inline xmlns:a="http://schemas.openxmlformats.org/drawingml/2006/main" xmlns:pic="http://schemas.openxmlformats.org/drawingml/2006/picture">
             <wp:extent cx="4114800" cy="3183146"/>
-            <wp:docPr id="23" name="Picture 23"/>
+            <wp:docPr id="20" name="Picture 20"/>
             <wp:cNvGraphicFramePr>
               <a:graphicFrameLocks noChangeAspect="1"/>
             </wp:cNvGraphicFramePr>
@@ -2174,7 +2111,7 @@
                     <pic:cNvPicPr/>
                   </pic:nvPicPr>
                   <pic:blipFill>
-                    <a:blip r:embed="rId31"/>
+                    <a:blip r:embed="rId28"/>
                     <a:stretch>
                       <a:fillRect/>
                     </a:stretch>
@@ -2205,8 +2142,8 @@
       <w:r>
         <w:drawing>
           <wp:inline xmlns:a="http://schemas.openxmlformats.org/drawingml/2006/main" xmlns:pic="http://schemas.openxmlformats.org/drawingml/2006/picture">
-            <wp:extent cx="4114800" cy="3447704"/>
-            <wp:docPr id="24" name="Picture 24"/>
+            <wp:extent cx="4114800" cy="3446691"/>
+            <wp:docPr id="21" name="Picture 21"/>
             <wp:cNvGraphicFramePr>
               <a:graphicFrameLocks noChangeAspect="1"/>
             </wp:cNvGraphicFramePr>
@@ -2218,7 +2155,7 @@
                     <pic:cNvPicPr/>
                   </pic:nvPicPr>
                   <pic:blipFill>
-                    <a:blip r:embed="rId32"/>
+                    <a:blip r:embed="rId29"/>
                     <a:stretch>
                       <a:fillRect/>
                     </a:stretch>
@@ -2226,7 +2163,7 @@
                   <pic:spPr>
                     <a:xfrm>
                       <a:off x="0" y="0"/>
-                      <a:ext cx="4114800" cy="3447704"/>
+                      <a:ext cx="4114800" cy="3446691"/>
                     </a:xfrm>
                     <a:prstGeom prst="rect"/>
                   </pic:spPr>
@@ -2249,8 +2186,8 @@
       <w:r>
         <w:drawing>
           <wp:inline xmlns:a="http://schemas.openxmlformats.org/drawingml/2006/main" xmlns:pic="http://schemas.openxmlformats.org/drawingml/2006/picture">
-            <wp:extent cx="4114800" cy="3446691"/>
-            <wp:docPr id="25" name="Picture 25"/>
+            <wp:extent cx="4114800" cy="3447704"/>
+            <wp:docPr id="22" name="Picture 22"/>
             <wp:cNvGraphicFramePr>
               <a:graphicFrameLocks noChangeAspect="1"/>
             </wp:cNvGraphicFramePr>
@@ -2262,7 +2199,7 @@
                     <pic:cNvPicPr/>
                   </pic:nvPicPr>
                   <pic:blipFill>
-                    <a:blip r:embed="rId33"/>
+                    <a:blip r:embed="rId30"/>
                     <a:stretch>
                       <a:fillRect/>
                     </a:stretch>
@@ -2270,431 +2207,7 @@
                   <pic:spPr>
                     <a:xfrm>
                       <a:off x="0" y="0"/>
-                      <a:ext cx="4114800" cy="3446691"/>
-                    </a:xfrm>
-                    <a:prstGeom prst="rect"/>
-                  </pic:spPr>
-                </pic:pic>
-              </a:graphicData>
-            </a:graphic>
-          </wp:inline>
-        </w:drawing>
-      </w:r>
-    </w:p>
-    <w:p>
-      <w:pPr>
-        <w:pStyle w:val="Heading1"/>
-      </w:pPr>
-      <w:r>
-        <w:t>8. Pile Foundation Design &amp; Verification</w:t>
-      </w:r>
-    </w:p>
-    <w:p>
-      <w:pPr>
-        <w:pStyle w:val="Heading2"/>
-      </w:pPr>
-      <w:r>
-        <w:t>Pile Cross Section Geometry &amp; Material Details</w:t>
-      </w:r>
-    </w:p>
-    <w:tbl>
-      <w:tblPr>
-        <w:tblStyle w:val="TableGrid"/>
-        <w:tblW w:type="auto" w:w="0"/>
-        <w:tblLook w:firstColumn="1" w:firstRow="1" w:lastColumn="0" w:lastRow="0" w:noHBand="0" w:noVBand="1" w:val="04A0"/>
-      </w:tblPr>
-      <w:tblGrid>
-        <w:gridCol w:w="3120"/>
-        <w:gridCol w:w="3120"/>
-        <w:gridCol w:w="3120"/>
-      </w:tblGrid>
-      <w:tr>
-        <w:tc>
-          <w:tcPr>
-            <w:tcW w:type="dxa" w:w="3120"/>
-          </w:tcPr>
-          <w:p>
-            <w:r>
-              <w:t>Parameter Name</w:t>
-            </w:r>
-          </w:p>
-        </w:tc>
-        <w:tc>
-          <w:tcPr>
-            <w:tcW w:type="dxa" w:w="3120"/>
-          </w:tcPr>
-          <w:p>
-            <w:r>
-              <w:t>Symbol</w:t>
-            </w:r>
-          </w:p>
-        </w:tc>
-        <w:tc>
-          <w:tcPr>
-            <w:tcW w:type="dxa" w:w="3120"/>
-          </w:tcPr>
-          <w:p>
-            <w:r>
-              <w:t>Value</w:t>
-            </w:r>
-          </w:p>
-        </w:tc>
-      </w:tr>
-      <w:tr>
-        <w:tc>
-          <w:tcPr>
-            <w:tcW w:type="dxa" w:w="3120"/>
-          </w:tcPr>
-          <w:p>
-            <w:r>
-              <w:t>Pile Material Type</w:t>
-            </w:r>
-          </w:p>
-        </w:tc>
-        <w:tc>
-          <w:tcPr>
-            <w:tcW w:type="dxa" w:w="3120"/>
-          </w:tcPr>
-          <w:p>
-            <w:r>
-              <w:t>-</w:t>
-            </w:r>
-          </w:p>
-        </w:tc>
-        <w:tc>
-          <w:tcPr>
-            <w:tcW w:type="dxa" w:w="3120"/>
-          </w:tcPr>
-          <w:p>
-            <w:r>
-              <w:t>Concrete</w:t>
-            </w:r>
-          </w:p>
-        </w:tc>
-      </w:tr>
-      <w:tr>
-        <w:tc>
-          <w:tcPr>
-            <w:tcW w:type="dxa" w:w="3120"/>
-          </w:tcPr>
-          <w:p>
-            <w:r>
-              <w:t>Pile Cross-section Shape</w:t>
-            </w:r>
-          </w:p>
-        </w:tc>
-        <w:tc>
-          <w:tcPr>
-            <w:tcW w:type="dxa" w:w="3120"/>
-          </w:tcPr>
-          <w:p>
-            <w:r>
-              <w:t>-</w:t>
-            </w:r>
-          </w:p>
-        </w:tc>
-        <w:tc>
-          <w:tcPr>
-            <w:tcW w:type="dxa" w:w="3120"/>
-          </w:tcPr>
-          <w:p>
-            <w:r>
-              <w:t>Circle</w:t>
-            </w:r>
-          </w:p>
-        </w:tc>
-      </w:tr>
-      <w:tr>
-        <w:tc>
-          <w:tcPr>
-            <w:tcW w:type="dxa" w:w="3120"/>
-          </w:tcPr>
-          <w:p>
-            <w:r>
-              <w:t>Pile Diameter</w:t>
-            </w:r>
-          </w:p>
-        </w:tc>
-        <w:tc>
-          <w:tcPr>
-            <w:tcW w:type="dxa" w:w="3120"/>
-          </w:tcPr>
-          <w:p>
-            <w:r>
-              <w:t>d_pile</w:t>
-            </w:r>
-          </w:p>
-        </w:tc>
-        <w:tc>
-          <w:tcPr>
-            <w:tcW w:type="dxa" w:w="3120"/>
-          </w:tcPr>
-          <w:p>
-            <w:r>
-              <w:t>0.400 m</w:t>
-            </w:r>
-          </w:p>
-        </w:tc>
-      </w:tr>
-      <w:tr>
-        <w:tc>
-          <w:tcPr>
-            <w:tcW w:type="dxa" w:w="3120"/>
-          </w:tcPr>
-          <w:p>
-            <w:r>
-              <w:t>Concrete Cover</w:t>
-            </w:r>
-          </w:p>
-        </w:tc>
-        <w:tc>
-          <w:tcPr>
-            <w:tcW w:type="dxa" w:w="3120"/>
-          </w:tcPr>
-          <w:p>
-            <w:r>
-              <w:t>d_c</w:t>
-            </w:r>
-          </w:p>
-        </w:tc>
-        <w:tc>
-          <w:tcPr>
-            <w:tcW w:type="dxa" w:w="3120"/>
-          </w:tcPr>
-          <w:p>
-            <w:r>
-              <w:t>50.0 mm</w:t>
-            </w:r>
-          </w:p>
-        </w:tc>
-      </w:tr>
-      <w:tr>
-        <w:tc>
-          <w:tcPr>
-            <w:tcW w:type="dxa" w:w="3120"/>
-          </w:tcPr>
-          <w:p>
-            <w:r>
-              <w:t>Main Reinforcement</w:t>
-            </w:r>
-          </w:p>
-        </w:tc>
-        <w:tc>
-          <w:tcPr>
-            <w:tcW w:type="dxa" w:w="3120"/>
-          </w:tcPr>
-          <w:p>
-            <w:r>
-              <w:t>-</w:t>
-            </w:r>
-          </w:p>
-        </w:tc>
-        <w:tc>
-          <w:tcPr>
-            <w:tcW w:type="dxa" w:w="3120"/>
-          </w:tcPr>
-          <w:p>
-            <w:r>
-              <w:t>8 D25</w:t>
-            </w:r>
-          </w:p>
-        </w:tc>
-      </w:tr>
-    </w:tbl>
-    <w:p>
-      <w:pPr>
-        <w:pStyle w:val="Heading2"/>
-      </w:pPr>
-      <w:r>
-        <w:t>Pile Cross-Section Drawing</w:t>
-      </w:r>
-    </w:p>
-    <w:p>
-      <w:r>
-        <w:drawing>
-          <wp:inline xmlns:a="http://schemas.openxmlformats.org/drawingml/2006/main" xmlns:pic="http://schemas.openxmlformats.org/drawingml/2006/picture">
-            <wp:extent cx="3200400" cy="2194560"/>
-            <wp:docPr id="26" name="Picture 26"/>
-            <wp:cNvGraphicFramePr>
-              <a:graphicFrameLocks noChangeAspect="1"/>
-            </wp:cNvGraphicFramePr>
-            <a:graphic>
-              <a:graphicData uri="http://schemas.openxmlformats.org/drawingml/2006/picture">
-                <pic:pic>
-                  <pic:nvPicPr>
-                    <pic:cNvPr id="0" name="pile_section.png"/>
-                    <pic:cNvPicPr/>
-                  </pic:nvPicPr>
-                  <pic:blipFill>
-                    <a:blip r:embed="rId34"/>
-                    <a:stretch>
-                      <a:fillRect/>
-                    </a:stretch>
-                  </pic:blipFill>
-                  <pic:spPr>
-                    <a:xfrm>
-                      <a:off x="0" y="0"/>
-                      <a:ext cx="3200400" cy="2194560"/>
-                    </a:xfrm>
-                    <a:prstGeom prst="rect"/>
-                  </pic:spPr>
-                </pic:pic>
-              </a:graphicData>
-            </a:graphic>
-          </wp:inline>
-        </w:drawing>
-      </w:r>
-    </w:p>
-    <w:p>
-      <w:pPr>
-        <w:pStyle w:val="Heading2"/>
-      </w:pPr>
-      <w:r>
-        <w:t>Pile Demands &amp; Safety Factors Checklist</w:t>
-      </w:r>
-    </w:p>
-    <w:p>
-      <w:r>
-        <w:t>Toe Pile Axial demand: 36.84 kN</w:t>
-      </w:r>
-    </w:p>
-    <w:p>
-      <w:r>
-        <w:t>Toe Pile Lateral demand: 48.10 kN</w:t>
-      </w:r>
-    </w:p>
-    <w:p>
-      <w:r>
-        <w:t>Heel Pile Axial demand: 49.75 kN</w:t>
-      </w:r>
-    </w:p>
-    <w:p>
-      <w:r>
-        <w:t>Heel Pile Lateral demand: 48.10 kN</w:t>
-      </w:r>
-    </w:p>
-    <w:p>
-      <w:pPr>
-        <w:pStyle w:val="Heading2"/>
-      </w:pPr>
-      <w:r>
-        <w:t>Pile Foundation Elevation Schematic</w:t>
-      </w:r>
-    </w:p>
-    <w:p>
-      <w:r>
-        <w:drawing>
-          <wp:inline xmlns:a="http://schemas.openxmlformats.org/drawingml/2006/main" xmlns:pic="http://schemas.openxmlformats.org/drawingml/2006/picture">
-            <wp:extent cx="4114800" cy="2828925"/>
-            <wp:docPr id="27" name="Picture 27"/>
-            <wp:cNvGraphicFramePr>
-              <a:graphicFrameLocks noChangeAspect="1"/>
-            </wp:cNvGraphicFramePr>
-            <a:graphic>
-              <a:graphicData uri="http://schemas.openxmlformats.org/drawingml/2006/picture">
-                <pic:pic>
-                  <pic:nvPicPr>
-                    <pic:cNvPr id="0" name="pile_elevation.png"/>
-                    <pic:cNvPicPr/>
-                  </pic:nvPicPr>
-                  <pic:blipFill>
-                    <a:blip r:embed="rId35"/>
-                    <a:stretch>
-                      <a:fillRect/>
-                    </a:stretch>
-                  </pic:blipFill>
-                  <pic:spPr>
-                    <a:xfrm>
-                      <a:off x="0" y="0"/>
-                      <a:ext cx="4114800" cy="2828925"/>
-                    </a:xfrm>
-                    <a:prstGeom prst="rect"/>
-                  </pic:spPr>
-                </pic:pic>
-              </a:graphicData>
-            </a:graphic>
-          </wp:inline>
-        </w:drawing>
-      </w:r>
-    </w:p>
-    <w:p>
-      <w:pPr>
-        <w:pStyle w:val="Heading2"/>
-      </w:pPr>
-      <w:r>
-        <w:t>Pile Winkler Analysis Elastic Profiles</w:t>
-      </w:r>
-    </w:p>
-    <w:p>
-      <w:r>
-        <w:drawing>
-          <wp:inline xmlns:a="http://schemas.openxmlformats.org/drawingml/2006/main" xmlns:pic="http://schemas.openxmlformats.org/drawingml/2006/picture">
-            <wp:extent cx="4114800" cy="2728592"/>
-            <wp:docPr id="28" name="Picture 28"/>
-            <wp:cNvGraphicFramePr>
-              <a:graphicFrameLocks noChangeAspect="1"/>
-            </wp:cNvGraphicFramePr>
-            <a:graphic>
-              <a:graphicData uri="http://schemas.openxmlformats.org/drawingml/2006/picture">
-                <pic:pic>
-                  <pic:nvPicPr>
-                    <pic:cNvPr id="0" name="pile_winkler.png"/>
-                    <pic:cNvPicPr/>
-                  </pic:nvPicPr>
-                  <pic:blipFill>
-                    <a:blip r:embed="rId36"/>
-                    <a:stretch>
-                      <a:fillRect/>
-                    </a:stretch>
-                  </pic:blipFill>
-                  <pic:spPr>
-                    <a:xfrm>
-                      <a:off x="0" y="0"/>
-                      <a:ext cx="4114800" cy="2728592"/>
-                    </a:xfrm>
-                    <a:prstGeom prst="rect"/>
-                  </pic:spPr>
-                </pic:pic>
-              </a:graphicData>
-            </a:graphic>
-          </wp:inline>
-        </w:drawing>
-      </w:r>
-    </w:p>
-    <w:p>
-      <w:pPr>
-        <w:pStyle w:val="Heading2"/>
-      </w:pPr>
-      <w:r>
-        <w:t>Moment-Axial Interaction Capacity Curve</w:t>
-      </w:r>
-    </w:p>
-    <w:p>
-      <w:r>
-        <w:drawing>
-          <wp:inline xmlns:a="http://schemas.openxmlformats.org/drawingml/2006/main" xmlns:pic="http://schemas.openxmlformats.org/drawingml/2006/picture">
-            <wp:extent cx="4114800" cy="3402623"/>
-            <wp:docPr id="29" name="Picture 29"/>
-            <wp:cNvGraphicFramePr>
-              <a:graphicFrameLocks noChangeAspect="1"/>
-            </wp:cNvGraphicFramePr>
-            <a:graphic>
-              <a:graphicData uri="http://schemas.openxmlformats.org/drawingml/2006/picture">
-                <pic:pic>
-                  <pic:nvPicPr>
-                    <pic:cNvPr id="0" name="pile_interaction.png"/>
-                    <pic:cNvPicPr/>
-                  </pic:nvPicPr>
-                  <pic:blipFill>
-                    <a:blip r:embed="rId37"/>
-                    <a:stretch>
-                      <a:fillRect/>
-                    </a:stretch>
-                  </pic:blipFill>
-                  <pic:spPr>
-                    <a:xfrm>
-                      <a:off x="0" y="0"/>
-                      <a:ext cx="4114800" cy="3402623"/>
+                      <a:ext cx="4114800" cy="3447704"/>
                     </a:xfrm>
                     <a:prstGeom prst="rect"/>
                   </pic:spPr>

</xml_diff>

<commit_message>
Update XSLOPE SSRM Stability Analysis, and some Minor UI Tweaks
</commit_message>
<xml_diff>
--- a/report_temp/retaining_wall_report.docx
+++ b/report_temp/retaining_wall_report.docx
@@ -24,7 +24,7 @@
         <w:rPr>
           <w:sz w:val="20"/>
         </w:rPr>
-        <w:t>Date: July 19, 2026</w:t>
+        <w:t>Date: September 26, 2026</w:t>
       </w:r>
     </w:p>
     <w:p>
@@ -315,102 +315,6 @@
           </w:p>
         </w:tc>
       </w:tr>
-      <w:tr>
-        <w:tc>
-          <w:tcPr>
-            <w:tcW w:type="dxa" w:w="3120"/>
-          </w:tcPr>
-          <w:p>
-            <w:r>
-              <w:t>Shear key distance</w:t>
-            </w:r>
-          </w:p>
-        </w:tc>
-        <w:tc>
-          <w:tcPr>
-            <w:tcW w:type="dxa" w:w="3120"/>
-          </w:tcPr>
-          <w:p>
-            <w:r>
-              <w:t>x_sk</w:t>
-            </w:r>
-          </w:p>
-        </w:tc>
-        <w:tc>
-          <w:tcPr>
-            <w:tcW w:type="dxa" w:w="3120"/>
-          </w:tcPr>
-          <w:p>
-            <w:r>
-              <w:t>1.200 m</w:t>
-            </w:r>
-          </w:p>
-        </w:tc>
-      </w:tr>
-      <w:tr>
-        <w:tc>
-          <w:tcPr>
-            <w:tcW w:type="dxa" w:w="3120"/>
-          </w:tcPr>
-          <w:p>
-            <w:r>
-              <w:t>Shear key width</w:t>
-            </w:r>
-          </w:p>
-        </w:tc>
-        <w:tc>
-          <w:tcPr>
-            <w:tcW w:type="dxa" w:w="3120"/>
-          </w:tcPr>
-          <w:p>
-            <w:r>
-              <w:t>w_sk</w:t>
-            </w:r>
-          </w:p>
-        </w:tc>
-        <w:tc>
-          <w:tcPr>
-            <w:tcW w:type="dxa" w:w="3120"/>
-          </w:tcPr>
-          <w:p>
-            <w:r>
-              <w:t>0.500 m</w:t>
-            </w:r>
-          </w:p>
-        </w:tc>
-      </w:tr>
-      <w:tr>
-        <w:tc>
-          <w:tcPr>
-            <w:tcW w:type="dxa" w:w="3120"/>
-          </w:tcPr>
-          <w:p>
-            <w:r>
-              <w:t>Shear key thickness</w:t>
-            </w:r>
-          </w:p>
-        </w:tc>
-        <w:tc>
-          <w:tcPr>
-            <w:tcW w:type="dxa" w:w="3120"/>
-          </w:tcPr>
-          <w:p>
-            <w:r>
-              <w:t>t_sk</w:t>
-            </w:r>
-          </w:p>
-        </w:tc>
-        <w:tc>
-          <w:tcPr>
-            <w:tcW w:type="dxa" w:w="3120"/>
-          </w:tcPr>
-          <w:p>
-            <w:r>
-              <w:t>0.200 m</w:t>
-            </w:r>
-          </w:p>
-        </w:tc>
-      </w:tr>
     </w:tbl>
     <w:p>
       <w:pPr>
@@ -616,7 +520,7 @@
           </w:tcPr>
           <w:p>
             <w:r>
-              <w:t>0.0000</w:t>
+              <w:t>0.0333</w:t>
             </w:r>
           </w:p>
         </w:tc>
@@ -626,7 +530,7 @@
           </w:tcPr>
           <w:p>
             <w:r>
-              <w:t>N/A (Vertical)</w:t>
+              <w:t>&gt;= 0.0208</w:t>
             </w:r>
           </w:p>
         </w:tc>
@@ -2006,25 +1910,121 @@
     </w:p>
     <w:p>
       <w:r>
-        <w:t>Sliding FS = inf (Required &gt;= 1.5)</w:t>
+        <w:t>Sliding FS = 69.171 (Required &gt;= 1.5)</w:t>
       </w:r>
     </w:p>
     <w:p>
       <w:r>
-        <w:t>Overturning FS = 4.087 (Required &gt;= 1.5)</w:t>
+        <w:t>Overturning FS = 4.025 (Required &gt;= 1.5)</w:t>
       </w:r>
     </w:p>
     <w:p>
       <w:r>
-        <w:t>Global Slope Stability SSRM FS = 1.706</w:t>
+        <w:t>Global Slope Stability SSRM FS = 2.726</w:t>
+      </w:r>
+    </w:p>
+    <w:p>
+      <w:pPr>
+        <w:pStyle w:val="Heading2"/>
+      </w:pPr>
+      <w:r>
+        <w:t>XSLOPE Slope Geometry &amp; Inputs Diagram</w:t>
       </w:r>
     </w:p>
     <w:p>
       <w:r>
         <w:drawing>
           <wp:inline xmlns:a="http://schemas.openxmlformats.org/drawingml/2006/main" xmlns:pic="http://schemas.openxmlformats.org/drawingml/2006/picture">
-            <wp:extent cx="4114800" cy="1417288"/>
+            <wp:extent cx="4114800" cy="2130820"/>
             <wp:docPr id="19" name="Picture 19"/>
+            <wp:cNvGraphicFramePr>
+              <a:graphicFrameLocks noChangeAspect="1"/>
+            </wp:cNvGraphicFramePr>
+            <a:graphic>
+              <a:graphicData uri="http://schemas.openxmlformats.org/drawingml/2006/picture">
+                <pic:pic>
+                  <pic:nvPicPr>
+                    <pic:cNvPr id="0" name="xslope_inputs.png"/>
+                    <pic:cNvPicPr/>
+                  </pic:nvPicPr>
+                  <pic:blipFill>
+                    <a:blip r:embed="rId27"/>
+                    <a:stretch>
+                      <a:fillRect/>
+                    </a:stretch>
+                  </pic:blipFill>
+                  <pic:spPr>
+                    <a:xfrm>
+                      <a:off x="0" y="0"/>
+                      <a:ext cx="4114800" cy="2130820"/>
+                    </a:xfrm>
+                    <a:prstGeom prst="rect"/>
+                  </pic:spPr>
+                </pic:pic>
+              </a:graphicData>
+            </a:graphic>
+          </wp:inline>
+        </w:drawing>
+      </w:r>
+    </w:p>
+    <w:p>
+      <w:pPr>
+        <w:pStyle w:val="Heading2"/>
+      </w:pPr>
+      <w:r>
+        <w:t>XSLOPE FEM Mesh with Material Zones (tri6)</w:t>
+      </w:r>
+    </w:p>
+    <w:p>
+      <w:r>
+        <w:drawing>
+          <wp:inline xmlns:a="http://schemas.openxmlformats.org/drawingml/2006/main" xmlns:pic="http://schemas.openxmlformats.org/drawingml/2006/picture">
+            <wp:extent cx="4114800" cy="1795549"/>
+            <wp:docPr id="20" name="Picture 20"/>
+            <wp:cNvGraphicFramePr>
+              <a:graphicFrameLocks noChangeAspect="1"/>
+            </wp:cNvGraphicFramePr>
+            <a:graphic>
+              <a:graphicData uri="http://schemas.openxmlformats.org/drawingml/2006/picture">
+                <pic:pic>
+                  <pic:nvPicPr>
+                    <pic:cNvPr id="0" name="xslope_mesh.png"/>
+                    <pic:cNvPicPr/>
+                  </pic:nvPicPr>
+                  <pic:blipFill>
+                    <a:blip r:embed="rId28"/>
+                    <a:stretch>
+                      <a:fillRect/>
+                    </a:stretch>
+                  </pic:blipFill>
+                  <pic:spPr>
+                    <a:xfrm>
+                      <a:off x="0" y="0"/>
+                      <a:ext cx="4114800" cy="1795549"/>
+                    </a:xfrm>
+                    <a:prstGeom prst="rect"/>
+                  </pic:spPr>
+                </pic:pic>
+              </a:graphicData>
+            </a:graphic>
+          </wp:inline>
+        </w:drawing>
+      </w:r>
+    </w:p>
+    <w:p>
+      <w:pPr>
+        <w:pStyle w:val="Heading2"/>
+      </w:pPr>
+      <w:r>
+        <w:t>2D SSRM Viscoplastic Shear Strain Failure Surface</w:t>
+      </w:r>
+    </w:p>
+    <w:p>
+      <w:r>
+        <w:drawing>
+          <wp:inline xmlns:a="http://schemas.openxmlformats.org/drawingml/2006/main" xmlns:pic="http://schemas.openxmlformats.org/drawingml/2006/picture">
+            <wp:extent cx="4114800" cy="1559112"/>
+            <wp:docPr id="21" name="Picture 21"/>
             <wp:cNvGraphicFramePr>
               <a:graphicFrameLocks noChangeAspect="1"/>
             </wp:cNvGraphicFramePr>
@@ -2036,7 +2036,7 @@
                     <pic:cNvPicPr/>
                   </pic:nvPicPr>
                   <pic:blipFill>
-                    <a:blip r:embed="rId27"/>
+                    <a:blip r:embed="rId29"/>
                     <a:stretch>
                       <a:fillRect/>
                     </a:stretch>
@@ -2044,7 +2044,7 @@
                   <pic:spPr>
                     <a:xfrm>
                       <a:off x="0" y="0"/>
-                      <a:ext cx="4114800" cy="1417288"/>
+                      <a:ext cx="4114800" cy="1559112"/>
                     </a:xfrm>
                     <a:prstGeom prst="rect"/>
                   </pic:spPr>
@@ -2060,22 +2060,181 @@
         <w:pStyle w:val="Heading1"/>
       </w:pPr>
       <w:r>
+        <w:t>5. Bearing Capacity &amp; Settlement</w:t>
+      </w:r>
+    </w:p>
+    <w:p>
+      <w:pPr>
+        <w:pStyle w:val="Heading2"/>
+      </w:pPr>
+      <w:r>
+        <w:t>Bearing Stress &amp; Settlement Equations</w:t>
+      </w:r>
+    </w:p>
+    <w:p>
+      <w:r>
+        <w:t>Bearing contact stress:</w:t>
+      </w:r>
+    </w:p>
+    <w:p>
+      <w:r>
+        <w:drawing>
+          <wp:inline xmlns:a="http://schemas.openxmlformats.org/drawingml/2006/main" xmlns:pic="http://schemas.openxmlformats.org/drawingml/2006/picture">
+            <wp:extent cx="2011680" cy="369535"/>
+            <wp:docPr id="22" name="Picture 22"/>
+            <wp:cNvGraphicFramePr>
+              <a:graphicFrameLocks noChangeAspect="1"/>
+            </wp:cNvGraphicFramePr>
+            <a:graphic>
+              <a:graphicData uri="http://schemas.openxmlformats.org/drawingml/2006/picture">
+                <pic:pic>
+                  <pic:nvPicPr>
+                    <pic:cNvPr id="0" name="eq_bearing_stress.png"/>
+                    <pic:cNvPicPr/>
+                  </pic:nvPicPr>
+                  <pic:blipFill>
+                    <a:blip r:embed="rId30"/>
+                    <a:stretch>
+                      <a:fillRect/>
+                    </a:stretch>
+                  </pic:blipFill>
+                  <pic:spPr>
+                    <a:xfrm>
+                      <a:off x="0" y="0"/>
+                      <a:ext cx="2011680" cy="369535"/>
+                    </a:xfrm>
+                    <a:prstGeom prst="rect"/>
+                  </pic:spPr>
+                </pic:pic>
+              </a:graphicData>
+            </a:graphic>
+          </wp:inline>
+        </w:drawing>
+      </w:r>
+    </w:p>
+    <w:p>
+      <w:r>
+        <w:t>Bearing safety factor:</w:t>
+      </w:r>
+    </w:p>
+    <w:p>
+      <w:r>
+        <w:drawing>
+          <wp:inline xmlns:a="http://schemas.openxmlformats.org/drawingml/2006/main" xmlns:pic="http://schemas.openxmlformats.org/drawingml/2006/picture">
+            <wp:extent cx="1645920" cy="302347"/>
+            <wp:docPr id="23" name="Picture 23"/>
+            <wp:cNvGraphicFramePr>
+              <a:graphicFrameLocks noChangeAspect="1"/>
+            </wp:cNvGraphicFramePr>
+            <a:graphic>
+              <a:graphicData uri="http://schemas.openxmlformats.org/drawingml/2006/picture">
+                <pic:pic>
+                  <pic:nvPicPr>
+                    <pic:cNvPr id="0" name="eq_bearing_fs.png"/>
+                    <pic:cNvPicPr/>
+                  </pic:nvPicPr>
+                  <pic:blipFill>
+                    <a:blip r:embed="rId31"/>
+                    <a:stretch>
+                      <a:fillRect/>
+                    </a:stretch>
+                  </pic:blipFill>
+                  <pic:spPr>
+                    <a:xfrm>
+                      <a:off x="0" y="0"/>
+                      <a:ext cx="1645920" cy="302347"/>
+                    </a:xfrm>
+                    <a:prstGeom prst="rect"/>
+                  </pic:spPr>
+                </pic:pic>
+              </a:graphicData>
+            </a:graphic>
+          </wp:inline>
+        </w:drawing>
+      </w:r>
+    </w:p>
+    <w:p>
+      <w:r>
+        <w:t>Consolidation settlement:</w:t>
+      </w:r>
+    </w:p>
+    <w:p>
+      <w:r>
+        <w:drawing>
+          <wp:inline xmlns:a="http://schemas.openxmlformats.org/drawingml/2006/main" xmlns:pic="http://schemas.openxmlformats.org/drawingml/2006/picture">
+            <wp:extent cx="2286000" cy="419926"/>
+            <wp:docPr id="24" name="Picture 24"/>
+            <wp:cNvGraphicFramePr>
+              <a:graphicFrameLocks noChangeAspect="1"/>
+            </wp:cNvGraphicFramePr>
+            <a:graphic>
+              <a:graphicData uri="http://schemas.openxmlformats.org/drawingml/2006/picture">
+                <pic:pic>
+                  <pic:nvPicPr>
+                    <pic:cNvPr id="0" name="eq_settlement.png"/>
+                    <pic:cNvPicPr/>
+                  </pic:nvPicPr>
+                  <pic:blipFill>
+                    <a:blip r:embed="rId32"/>
+                    <a:stretch>
+                      <a:fillRect/>
+                    </a:stretch>
+                  </pic:blipFill>
+                  <pic:spPr>
+                    <a:xfrm>
+                      <a:off x="0" y="0"/>
+                      <a:ext cx="2286000" cy="419926"/>
+                    </a:xfrm>
+                    <a:prstGeom prst="rect"/>
+                  </pic:spPr>
+                </pic:pic>
+              </a:graphicData>
+            </a:graphic>
+          </wp:inline>
+        </w:drawing>
+      </w:r>
+    </w:p>
+    <w:p>
+      <w:r>
+        <w:t>Ultimate bearing capacity: 4544.33 kPa</w:t>
+      </w:r>
+    </w:p>
+    <w:p>
+      <w:r>
+        <w:t>Max bearing stress: 46.26 kPa</w:t>
+      </w:r>
+    </w:p>
+    <w:p>
+      <w:r>
+        <w:t>Safety factor: 98.23 (Required &gt;= 3.0)</w:t>
+      </w:r>
+    </w:p>
+    <w:p>
+      <w:r>
+        <w:t>Consolidation Settlement: 87.00 mm (Allowable: 153.33 mm)</w:t>
+      </w:r>
+    </w:p>
+    <w:p>
+      <w:pPr>
+        <w:pStyle w:val="Heading1"/>
+      </w:pPr>
+      <w:r>
         <w:t>6. Finite Element Settlement &amp; Base Displacements</w:t>
       </w:r>
     </w:p>
     <w:p>
       <w:r>
-        <w:t>Toe Settlement: 3.13 mm</w:t>
+        <w:t>Toe Settlement: 23.43 mm</w:t>
       </w:r>
     </w:p>
     <w:p>
       <w:r>
-        <w:t>Heel Settlement: 1.42 mm</w:t>
+        <w:t>Heel Settlement: 18.14 mm</w:t>
       </w:r>
     </w:p>
     <w:p>
       <w:r>
-        <w:t>Differential Settlement: 1.71 mm (Allowable: 50.00 mm)</w:t>
+        <w:t>Differential Settlement: 41.57 mm (Allowable: 50.00 mm)</w:t>
       </w:r>
     </w:p>
     <w:p>
@@ -2099,7 +2258,7 @@
         <w:drawing>
           <wp:inline xmlns:a="http://schemas.openxmlformats.org/drawingml/2006/main" xmlns:pic="http://schemas.openxmlformats.org/drawingml/2006/picture">
             <wp:extent cx="4114800" cy="3183146"/>
-            <wp:docPr id="20" name="Picture 20"/>
+            <wp:docPr id="25" name="Picture 25"/>
             <wp:cNvGraphicFramePr>
               <a:graphicFrameLocks noChangeAspect="1"/>
             </wp:cNvGraphicFramePr>
@@ -2111,7 +2270,7 @@
                     <pic:cNvPicPr/>
                   </pic:nvPicPr>
                   <pic:blipFill>
-                    <a:blip r:embed="rId28"/>
+                    <a:blip r:embed="rId33"/>
                     <a:stretch>
                       <a:fillRect/>
                     </a:stretch>
@@ -2142,8 +2301,8 @@
       <w:r>
         <w:drawing>
           <wp:inline xmlns:a="http://schemas.openxmlformats.org/drawingml/2006/main" xmlns:pic="http://schemas.openxmlformats.org/drawingml/2006/picture">
-            <wp:extent cx="4114800" cy="3446691"/>
-            <wp:docPr id="21" name="Picture 21"/>
+            <wp:extent cx="4114800" cy="3447704"/>
+            <wp:docPr id="26" name="Picture 26"/>
             <wp:cNvGraphicFramePr>
               <a:graphicFrameLocks noChangeAspect="1"/>
             </wp:cNvGraphicFramePr>
@@ -2155,7 +2314,7 @@
                     <pic:cNvPicPr/>
                   </pic:nvPicPr>
                   <pic:blipFill>
-                    <a:blip r:embed="rId29"/>
+                    <a:blip r:embed="rId34"/>
                     <a:stretch>
                       <a:fillRect/>
                     </a:stretch>
@@ -2163,7 +2322,7 @@
                   <pic:spPr>
                     <a:xfrm>
                       <a:off x="0" y="0"/>
-                      <a:ext cx="4114800" cy="3446691"/>
+                      <a:ext cx="4114800" cy="3447704"/>
                     </a:xfrm>
                     <a:prstGeom prst="rect"/>
                   </pic:spPr>
@@ -2186,8 +2345,8 @@
       <w:r>
         <w:drawing>
           <wp:inline xmlns:a="http://schemas.openxmlformats.org/drawingml/2006/main" xmlns:pic="http://schemas.openxmlformats.org/drawingml/2006/picture">
-            <wp:extent cx="4114800" cy="3447704"/>
-            <wp:docPr id="22" name="Picture 22"/>
+            <wp:extent cx="4114800" cy="3446691"/>
+            <wp:docPr id="27" name="Picture 27"/>
             <wp:cNvGraphicFramePr>
               <a:graphicFrameLocks noChangeAspect="1"/>
             </wp:cNvGraphicFramePr>
@@ -2199,7 +2358,7 @@
                     <pic:cNvPicPr/>
                   </pic:nvPicPr>
                   <pic:blipFill>
-                    <a:blip r:embed="rId30"/>
+                    <a:blip r:embed="rId35"/>
                     <a:stretch>
                       <a:fillRect/>
                     </a:stretch>
@@ -2207,7 +2366,7 @@
                   <pic:spPr>
                     <a:xfrm>
                       <a:off x="0" y="0"/>
-                      <a:ext cx="4114800" cy="3447704"/>
+                      <a:ext cx="4114800" cy="3446691"/>
                     </a:xfrm>
                     <a:prstGeom prst="rect"/>
                   </pic:spPr>

</xml_diff>